<commit_message>
Enhances contract generation and opportunity details
Improves contract generation by fetching the file URL with the bucket in the key and allowing additional debtors data.

Adds a co-debtors view to the opportunity details modal.

Temporarily disables CRM saving for faster contract generation.

Fixes an issue where profession was defaulting incorrectly.
</commit_message>
<xml_diff>
--- a/apps/legal-docs-blueprints/templates/solicitud_compra_vehiculo/solicitud_compra_vehiculo-mujer-plural.docx
+++ b/apps/legal-docs-blueprints/templates/solicitud_compra_vehiculo/solicitud_compra_vehiculo-mujer-plural.docx
@@ -439,7 +439,7 @@
           <w:sz w:val="20"/>
           <w:szCs w:val="20"/>
         </w:rPr>
-        <w:t>, identificadas con DPI</w:t>
+        <w:t>, identificada con DPI</w:t>
       </w:r>
       <w:r>
         <w:rPr/>
@@ -502,7 +502,25 @@
           <w:sz w:val="20"/>
           <w:szCs w:val="20"/>
         </w:rPr>
-        <w:t xml:space="preserve">, atentamente solicito sus servicios a la plataforma </w:t>
+        <w:t>, atentamente solicit</w:t>
+      </w:r>
+      <w:r>
+        <w:rPr>
+          <w:rFonts w:eastAsia="Arial" w:cs="Arial" w:ascii="Arial" w:hAnsi="Arial"/>
+          <w:color w:val="000000"/>
+          <w:sz w:val="20"/>
+          <w:szCs w:val="20"/>
+        </w:rPr>
+        <w:t>amos</w:t>
+      </w:r>
+      <w:r>
+        <w:rPr>
+          <w:rFonts w:eastAsia="Arial" w:cs="Arial" w:ascii="Arial" w:hAnsi="Arial"/>
+          <w:color w:val="000000"/>
+          <w:sz w:val="20"/>
+          <w:szCs w:val="20"/>
+        </w:rPr>
+        <w:t xml:space="preserve"> sus servicios a la plataforma </w:t>
       </w:r>
       <w:r>
         <w:rPr>
@@ -1152,14 +1170,7 @@
                 <w:rFonts w:ascii="Arial" w:hAnsi="Arial"/>
                 <w:sz w:val="20"/>
               </w:rPr>
-              <w:t>f</w:t>
-            </w:r>
-            <w:r>
-              <w:rPr>
-                <w:rFonts w:ascii="Arial" w:hAnsi="Arial"/>
-                <w:sz w:val="20"/>
-              </w:rPr>
-              <w:t>)________________________</w:t>
+              <w:t>f)________________________</w:t>
             </w:r>
           </w:p>
           <w:p>
@@ -1237,14 +1248,7 @@
                 <w:rFonts w:ascii="Arial" w:hAnsi="Arial"/>
                 <w:sz w:val="20"/>
               </w:rPr>
-              <w:t>f</w:t>
-            </w:r>
-            <w:r>
-              <w:rPr>
-                <w:rFonts w:ascii="Arial" w:hAnsi="Arial"/>
-                <w:sz w:val="20"/>
-              </w:rPr>
-              <w:t>)________________________</w:t>
+              <w:t>f)________________________</w:t>
             </w:r>
           </w:p>
           <w:p>

</xml_diff>